<commit_message>
court(cafc) answering-brief, opening-brief docx: Times New Roman (DEF-FONT-002), certificate boxes as bordered runs instead of DejaVu glyphs; docx checks green (fb-595.59)
</commit_message>
<xml_diff>
--- a/courts/federal-circuit/court-of-appeals/answering-brief/usage/OUTPUT-answering-brief.docx
+++ b/courts/federal-circuit/court-of-appeals/answering-brief/usage/OUTPUT-answering-brief.docx
@@ -759,7 +759,7 @@
         <w:tab/>
       </w:r>
       <w:r>
-        <w:t xml:space="preserve">4</w:t>
+        <w:t xml:space="preserve">5</w:t>
       </w:r>
     </w:p>
     <w:p>
@@ -1564,7 +1564,7 @@
         <w:pStyle w:val="CertificateText"/>
       </w:pPr>
       <w:r>
-        <w:t xml:space="preserve">I certify that this brief complies with the type-volume limitation of Fed. Cir. R. 32(b). The total number of words in the brief is 1,326, as calculated by Microsoft Word.</w:t>
+        <w:t xml:space="preserve">I certify that this brief complies with the type-volume limitation of Fed. Cir. R. 32(b). The total number of words in the brief is 1,326, as calculated by the word-processing system used to prepare it.</w:t>
       </w:r>
     </w:p>
     <w:p>
@@ -1921,7 +1921,7 @@
         <w:ind w:left="720" w:hanging="360"/>
       </w:pPr>
       <w:rPr>
-        <w:rFonts w:ascii="EB Garamond" w:hAnsi="EB Garamond" w:cs="EB Garamond" w:hint="default"/>
+        <w:rFonts w:ascii="Times New Roman" w:hAnsi="Times New Roman" w:cs="Times New Roman" w:hint="default"/>
       </w:rPr>
     </w:lvl>
     <w:lvl w:ilvl="1">
@@ -1954,7 +1954,7 @@
         <w:ind w:left="2880" w:hanging="360"/>
       </w:pPr>
       <w:rPr>
-        <w:rFonts w:ascii="EB Garamond" w:hAnsi="EB Garamond" w:cs="EB Garamond" w:hint="default"/>
+        <w:rFonts w:ascii="Times New Roman" w:hAnsi="Times New Roman" w:cs="Times New Roman" w:hint="default"/>
       </w:rPr>
     </w:lvl>
     <w:lvl w:ilvl="4">
@@ -1987,7 +1987,7 @@
         <w:ind w:left="5040" w:hanging="360"/>
       </w:pPr>
       <w:rPr>
-        <w:rFonts w:ascii="EB Garamond" w:hAnsi="EB Garamond" w:cs="EB Garamond" w:hint="default"/>
+        <w:rFonts w:ascii="Times New Roman" w:hAnsi="Times New Roman" w:cs="Times New Roman" w:hint="default"/>
       </w:rPr>
     </w:lvl>
     <w:lvl w:ilvl="7">
@@ -2027,7 +2027,7 @@
   <w:docDefaults>
     <w:rPrDefault>
       <w:rPr>
-        <w:rFonts w:ascii="EB Garamond" w:hAnsi="EB Garamond" w:eastAsia="EB Garamond" w:cs="EB Garamond"/>
+        <w:rFonts w:ascii="Times New Roman" w:hAnsi="Times New Roman" w:eastAsia="Times New Roman" w:cs="Times New Roman"/>
         <w:sz w:val="28"/>
         <w:szCs w:val="28"/>
         <w:lang w:val="en-US" w:eastAsia="en-US" w:bidi="ar-SA"/>

</xml_diff>

<commit_message>
court(cafc) answering-brief: latex and docx break after a slash before a letter and set the ellipsis as typst does; XENG-001..003 pass on latex and docx, params.cross_engine: gate (fb-595.54.6)
</commit_message>
<xml_diff>
--- a/courts/federal-circuit/court-of-appeals/answering-brief/usage/OUTPUT-answering-brief.docx
+++ b/courts/federal-circuit/court-of-appeals/answering-brief/usage/OUTPUT-answering-brief.docx
@@ -4105,7 +4105,7 @@
         <w:pStyle w:val="BodyText"/>
       </w:pPr>
       <w:r>
-        <w:t xml:space="preserve">The ’019 application was filed on August 23, 2021, and is a continuation application in a series of applications that claim priority to International Application PCT/EP2012/062251, filed June 25, 2012. Appx20. Appellants rely on that PCT application date as the patent-term filing date for their application (i.e., the date from which their 20-year patent term is calculated). Br. at 3. The first-filed application in the series of applications was filed June 25, 2012, as Application No. 14/128,681 (the ’681 application), the national stage entry of PCT/EP2012/062251. Appx12; Appx190;</w:t>
+        <w:t xml:space="preserve">The ’019 application was filed on August 23, 2021, and is a continuation application in a series of applications that claim priority to International Application PCT/​EP2012/062251, filed June 25, 2012. Appx20. Appellants rely on that PCT application date as the patent-term filing date for their application (i.e., the date from which their 20-year patent term is calculated). Br. at 3. The first-filed application in the series of applications was filed June 25, 2012, as Application No. 14/128,681 (the ’681 application), the national stage entry of PCT/​EP2012/062251. Appx12; Appx190;</w:t>
       </w:r>
       <w:r>
         <w:t xml:space="preserve"> </w:t>
@@ -5467,7 +5467,7 @@
         <w:ind w:left="4680" w:firstLine="0"/>
       </w:pPr>
       <w:r>
-        <w:t xml:space="preserve">/s/ Kakoli Caprihan</w:t>
+        <w:t xml:space="preserve">/​s/ Kakoli Caprihan</w:t>
       </w:r>
     </w:p>
     <w:p>
@@ -5897,7 +5897,7 @@
         <w:ind w:left="4680" w:firstLine="0"/>
       </w:pPr>
       <w:r>
-        <w:t xml:space="preserve">/s/ Kakoli Caprihan</w:t>
+        <w:t xml:space="preserve">/​s/ Kakoli Caprihan</w:t>
       </w:r>
     </w:p>
     <w:p>
@@ -6063,7 +6063,7 @@
         <w:ind w:left="0" w:firstLine="0"/>
       </w:pPr>
       <w:r>
-        <w:t xml:space="preserve">I certify that on August 14, 2026 I electronically filed the foregoing brief with the Clerk of Court using the CM/ECF system, which will send notice of the filing to all counsel of record.</w:t>
+        <w:t xml:space="preserve">I certify that on August 14, 2026 I electronically filed the foregoing brief with the Clerk of Court using the CM/​ECF system, which will send notice of the filing to all counsel of record.</w:t>
       </w:r>
     </w:p>
     <w:p>
@@ -6074,7 +6074,7 @@
         <w:ind w:left="4680" w:firstLine="0"/>
       </w:pPr>
       <w:r>
-        <w:t xml:space="preserve">/s/ Kakoli Caprihan</w:t>
+        <w:t xml:space="preserve">/​s/ Kakoli Caprihan</w:t>
       </w:r>
     </w:p>
     <w:p>

</xml_diff>